<commit_message>
update technology stack in work experience section and refresh CV document formats
</commit_message>
<xml_diff>
--- a/saman_nezafat_cv.docx
+++ b/saman_nezafat_cv.docx
@@ -104,7 +104,7 @@
           <w:color w:val="555555"/>
           <w:sz w:val="18"/>
         </w:rPr>
-        <w:t>Stack: Go, Redis, ClickHouse, PostgreSQL, Docker</w:t>
+        <w:t>Stack: Go, Redis, ClickHouse, MongoDB, Docker</w:t>
       </w:r>
     </w:p>
     <w:p>
@@ -736,7 +736,7 @@
           <w:color w:val="555555"/>
           <w:sz w:val="18"/>
         </w:rPr>
-        <w:t>Stack: Python, Django, PostgreSQL</w:t>
+        <w:t>Stack: Python, FastAPI, PostgreSQL</w:t>
       </w:r>
     </w:p>
     <w:p>

</xml_diff>